<commit_message>
docs: líneas en las tablas del plan de pruebas CRUD
Co-Authored-By: Claude Opus 5.5 <noreply@anthropic.com>
</commit_message>
<xml_diff>
--- a/docs/entrega-2do-corte/03_Verificacion_y_validacion/Plan_de_Pruebas_50_Casos_CRUD_StockPot.docx
+++ b/docs/entrega-2do-corte/03_Verificacion_y_validacion/Plan_de_Pruebas_50_Casos_CRUD_StockPot.docx
@@ -363,6 +363,14 @@
       <w:tblPr>
         <w:tblW w:type="auto" w:w="0"/>
         <w:jc w:val="center"/>
+        <w:tblBorders>
+          <w:top w:val="single" w:sz="4" w:space="0" w:color="8C96A3"/>
+          <w:left w:val="single" w:sz="4" w:space="0" w:color="8C96A3"/>
+          <w:bottom w:val="single" w:sz="4" w:space="0" w:color="8C96A3"/>
+          <w:right w:val="single" w:sz="4" w:space="0" w:color="8C96A3"/>
+          <w:insideH w:val="single" w:sz="4" w:space="0" w:color="8C96A3"/>
+          <w:insideV w:val="single" w:sz="4" w:space="0" w:color="8C96A3"/>
+        </w:tblBorders>
         <w:tblLayout w:type="fixed"/>
         <w:tblLook w:firstColumn="1" w:firstRow="1" w:lastColumn="0" w:lastRow="0" w:noHBand="0" w:noVBand="1" w:val="04A0"/>
       </w:tblPr>
@@ -930,6 +938,14 @@
       <w:tblPr>
         <w:tblW w:type="auto" w:w="0"/>
         <w:jc w:val="center"/>
+        <w:tblBorders>
+          <w:top w:val="single" w:sz="4" w:space="0" w:color="8C96A3"/>
+          <w:left w:val="single" w:sz="4" w:space="0" w:color="8C96A3"/>
+          <w:bottom w:val="single" w:sz="4" w:space="0" w:color="8C96A3"/>
+          <w:right w:val="single" w:sz="4" w:space="0" w:color="8C96A3"/>
+          <w:insideH w:val="single" w:sz="4" w:space="0" w:color="8C96A3"/>
+          <w:insideV w:val="single" w:sz="4" w:space="0" w:color="8C96A3"/>
+        </w:tblBorders>
         <w:tblLayout w:type="fixed"/>
         <w:tblLook w:firstColumn="1" w:firstRow="1" w:lastColumn="0" w:lastRow="0" w:noHBand="0" w:noVBand="1" w:val="04A0"/>
       </w:tblPr>
@@ -1484,6 +1500,14 @@
       <w:tblPr>
         <w:tblW w:type="auto" w:w="0"/>
         <w:jc w:val="center"/>
+        <w:tblBorders>
+          <w:top w:val="single" w:sz="4" w:space="0" w:color="8C96A3"/>
+          <w:left w:val="single" w:sz="4" w:space="0" w:color="8C96A3"/>
+          <w:bottom w:val="single" w:sz="4" w:space="0" w:color="8C96A3"/>
+          <w:right w:val="single" w:sz="4" w:space="0" w:color="8C96A3"/>
+          <w:insideH w:val="single" w:sz="4" w:space="0" w:color="8C96A3"/>
+          <w:insideV w:val="single" w:sz="4" w:space="0" w:color="8C96A3"/>
+        </w:tblBorders>
         <w:tblLayout w:type="fixed"/>
         <w:tblLook w:firstColumn="1" w:firstRow="1" w:lastColumn="0" w:lastRow="0" w:noHBand="0" w:noVBand="1" w:val="04A0"/>
       </w:tblPr>
@@ -2051,6 +2075,14 @@
       <w:tblPr>
         <w:tblW w:type="auto" w:w="0"/>
         <w:jc w:val="center"/>
+        <w:tblBorders>
+          <w:top w:val="single" w:sz="4" w:space="0" w:color="8C96A3"/>
+          <w:left w:val="single" w:sz="4" w:space="0" w:color="8C96A3"/>
+          <w:bottom w:val="single" w:sz="4" w:space="0" w:color="8C96A3"/>
+          <w:right w:val="single" w:sz="4" w:space="0" w:color="8C96A3"/>
+          <w:insideH w:val="single" w:sz="4" w:space="0" w:color="8C96A3"/>
+          <w:insideV w:val="single" w:sz="4" w:space="0" w:color="8C96A3"/>
+        </w:tblBorders>
         <w:tblLayout w:type="fixed"/>
         <w:tblLook w:firstColumn="1" w:firstRow="1" w:lastColumn="0" w:lastRow="0" w:noHBand="0" w:noVBand="1" w:val="04A0"/>
       </w:tblPr>
@@ -2618,6 +2650,14 @@
       <w:tblPr>
         <w:tblW w:type="auto" w:w="0"/>
         <w:jc w:val="center"/>
+        <w:tblBorders>
+          <w:top w:val="single" w:sz="4" w:space="0" w:color="8C96A3"/>
+          <w:left w:val="single" w:sz="4" w:space="0" w:color="8C96A3"/>
+          <w:bottom w:val="single" w:sz="4" w:space="0" w:color="8C96A3"/>
+          <w:right w:val="single" w:sz="4" w:space="0" w:color="8C96A3"/>
+          <w:insideH w:val="single" w:sz="4" w:space="0" w:color="8C96A3"/>
+          <w:insideV w:val="single" w:sz="4" w:space="0" w:color="8C96A3"/>
+        </w:tblBorders>
         <w:tblLayout w:type="fixed"/>
         <w:tblLook w:firstColumn="1" w:firstRow="1" w:lastColumn="0" w:lastRow="0" w:noHBand="0" w:noVBand="1" w:val="04A0"/>
       </w:tblPr>
@@ -3195,6 +3235,14 @@
       <w:tblPr>
         <w:tblW w:type="auto" w:w="0"/>
         <w:jc w:val="center"/>
+        <w:tblBorders>
+          <w:top w:val="single" w:sz="4" w:space="0" w:color="8C96A3"/>
+          <w:left w:val="single" w:sz="4" w:space="0" w:color="8C96A3"/>
+          <w:bottom w:val="single" w:sz="4" w:space="0" w:color="8C96A3"/>
+          <w:right w:val="single" w:sz="4" w:space="0" w:color="8C96A3"/>
+          <w:insideH w:val="single" w:sz="4" w:space="0" w:color="8C96A3"/>
+          <w:insideV w:val="single" w:sz="4" w:space="0" w:color="8C96A3"/>
+        </w:tblBorders>
         <w:tblLayout w:type="fixed"/>
         <w:tblLook w:firstColumn="1" w:firstRow="1" w:lastColumn="0" w:lastRow="0" w:noHBand="0" w:noVBand="1" w:val="04A0"/>
       </w:tblPr>
@@ -3749,6 +3797,14 @@
       <w:tblPr>
         <w:tblW w:type="auto" w:w="0"/>
         <w:jc w:val="center"/>
+        <w:tblBorders>
+          <w:top w:val="single" w:sz="4" w:space="0" w:color="8C96A3"/>
+          <w:left w:val="single" w:sz="4" w:space="0" w:color="8C96A3"/>
+          <w:bottom w:val="single" w:sz="4" w:space="0" w:color="8C96A3"/>
+          <w:right w:val="single" w:sz="4" w:space="0" w:color="8C96A3"/>
+          <w:insideH w:val="single" w:sz="4" w:space="0" w:color="8C96A3"/>
+          <w:insideV w:val="single" w:sz="4" w:space="0" w:color="8C96A3"/>
+        </w:tblBorders>
         <w:tblLayout w:type="fixed"/>
         <w:tblLook w:firstColumn="1" w:firstRow="1" w:lastColumn="0" w:lastRow="0" w:noHBand="0" w:noVBand="1" w:val="04A0"/>
       </w:tblPr>
@@ -4290,6 +4346,14 @@
       <w:tblPr>
         <w:tblW w:type="auto" w:w="0"/>
         <w:jc w:val="center"/>
+        <w:tblBorders>
+          <w:top w:val="single" w:sz="4" w:space="0" w:color="8C96A3"/>
+          <w:left w:val="single" w:sz="4" w:space="0" w:color="8C96A3"/>
+          <w:bottom w:val="single" w:sz="4" w:space="0" w:color="8C96A3"/>
+          <w:right w:val="single" w:sz="4" w:space="0" w:color="8C96A3"/>
+          <w:insideH w:val="single" w:sz="4" w:space="0" w:color="8C96A3"/>
+          <w:insideV w:val="single" w:sz="4" w:space="0" w:color="8C96A3"/>
+        </w:tblBorders>
         <w:tblLayout w:type="fixed"/>
         <w:tblLook w:firstColumn="1" w:firstRow="1" w:lastColumn="0" w:lastRow="0" w:noHBand="0" w:noVBand="1" w:val="04A0"/>
       </w:tblPr>
@@ -4857,6 +4921,14 @@
       <w:tblPr>
         <w:tblW w:type="auto" w:w="0"/>
         <w:jc w:val="center"/>
+        <w:tblBorders>
+          <w:top w:val="single" w:sz="4" w:space="0" w:color="8C96A3"/>
+          <w:left w:val="single" w:sz="4" w:space="0" w:color="8C96A3"/>
+          <w:bottom w:val="single" w:sz="4" w:space="0" w:color="8C96A3"/>
+          <w:right w:val="single" w:sz="4" w:space="0" w:color="8C96A3"/>
+          <w:insideH w:val="single" w:sz="4" w:space="0" w:color="8C96A3"/>
+          <w:insideV w:val="single" w:sz="4" w:space="0" w:color="8C96A3"/>
+        </w:tblBorders>
         <w:tblLayout w:type="fixed"/>
         <w:tblLook w:firstColumn="1" w:firstRow="1" w:lastColumn="0" w:lastRow="0" w:noHBand="0" w:noVBand="1" w:val="04A0"/>
       </w:tblPr>
@@ -5421,6 +5493,14 @@
       <w:tblPr>
         <w:tblW w:type="auto" w:w="0"/>
         <w:jc w:val="center"/>
+        <w:tblBorders>
+          <w:top w:val="single" w:sz="4" w:space="0" w:color="8C96A3"/>
+          <w:left w:val="single" w:sz="4" w:space="0" w:color="8C96A3"/>
+          <w:bottom w:val="single" w:sz="4" w:space="0" w:color="8C96A3"/>
+          <w:right w:val="single" w:sz="4" w:space="0" w:color="8C96A3"/>
+          <w:insideH w:val="single" w:sz="4" w:space="0" w:color="8C96A3"/>
+          <w:insideV w:val="single" w:sz="4" w:space="0" w:color="8C96A3"/>
+        </w:tblBorders>
         <w:tblLayout w:type="fixed"/>
         <w:tblLook w:firstColumn="1" w:firstRow="1" w:lastColumn="0" w:lastRow="0" w:noHBand="0" w:noVBand="1" w:val="04A0"/>
       </w:tblPr>
@@ -5988,6 +6068,14 @@
       <w:tblPr>
         <w:tblW w:type="auto" w:w="0"/>
         <w:jc w:val="center"/>
+        <w:tblBorders>
+          <w:top w:val="single" w:sz="4" w:space="0" w:color="8C96A3"/>
+          <w:left w:val="single" w:sz="4" w:space="0" w:color="8C96A3"/>
+          <w:bottom w:val="single" w:sz="4" w:space="0" w:color="8C96A3"/>
+          <w:right w:val="single" w:sz="4" w:space="0" w:color="8C96A3"/>
+          <w:insideH w:val="single" w:sz="4" w:space="0" w:color="8C96A3"/>
+          <w:insideV w:val="single" w:sz="4" w:space="0" w:color="8C96A3"/>
+        </w:tblBorders>
         <w:tblLayout w:type="fixed"/>
         <w:tblLook w:firstColumn="1" w:firstRow="1" w:lastColumn="0" w:lastRow="0" w:noHBand="0" w:noVBand="1" w:val="04A0"/>
       </w:tblPr>
@@ -6529,6 +6617,14 @@
       <w:tblPr>
         <w:tblW w:type="auto" w:w="0"/>
         <w:jc w:val="center"/>
+        <w:tblBorders>
+          <w:top w:val="single" w:sz="4" w:space="0" w:color="8C96A3"/>
+          <w:left w:val="single" w:sz="4" w:space="0" w:color="8C96A3"/>
+          <w:bottom w:val="single" w:sz="4" w:space="0" w:color="8C96A3"/>
+          <w:right w:val="single" w:sz="4" w:space="0" w:color="8C96A3"/>
+          <w:insideH w:val="single" w:sz="4" w:space="0" w:color="8C96A3"/>
+          <w:insideV w:val="single" w:sz="4" w:space="0" w:color="8C96A3"/>
+        </w:tblBorders>
         <w:tblLayout w:type="fixed"/>
         <w:tblLook w:firstColumn="1" w:firstRow="1" w:lastColumn="0" w:lastRow="0" w:noHBand="0" w:noVBand="1" w:val="04A0"/>
       </w:tblPr>
@@ -7083,6 +7179,14 @@
       <w:tblPr>
         <w:tblW w:type="auto" w:w="0"/>
         <w:jc w:val="center"/>
+        <w:tblBorders>
+          <w:top w:val="single" w:sz="4" w:space="0" w:color="8C96A3"/>
+          <w:left w:val="single" w:sz="4" w:space="0" w:color="8C96A3"/>
+          <w:bottom w:val="single" w:sz="4" w:space="0" w:color="8C96A3"/>
+          <w:right w:val="single" w:sz="4" w:space="0" w:color="8C96A3"/>
+          <w:insideH w:val="single" w:sz="4" w:space="0" w:color="8C96A3"/>
+          <w:insideV w:val="single" w:sz="4" w:space="0" w:color="8C96A3"/>
+        </w:tblBorders>
         <w:tblLayout w:type="fixed"/>
         <w:tblLook w:firstColumn="1" w:firstRow="1" w:lastColumn="0" w:lastRow="0" w:noHBand="0" w:noVBand="1" w:val="04A0"/>
       </w:tblPr>
@@ -7634,6 +7738,14 @@
       <w:tblPr>
         <w:tblW w:type="auto" w:w="0"/>
         <w:jc w:val="center"/>
+        <w:tblBorders>
+          <w:top w:val="single" w:sz="4" w:space="0" w:color="8C96A3"/>
+          <w:left w:val="single" w:sz="4" w:space="0" w:color="8C96A3"/>
+          <w:bottom w:val="single" w:sz="4" w:space="0" w:color="8C96A3"/>
+          <w:right w:val="single" w:sz="4" w:space="0" w:color="8C96A3"/>
+          <w:insideH w:val="single" w:sz="4" w:space="0" w:color="8C96A3"/>
+          <w:insideV w:val="single" w:sz="4" w:space="0" w:color="8C96A3"/>
+        </w:tblBorders>
         <w:tblLayout w:type="fixed"/>
         <w:tblLook w:firstColumn="1" w:firstRow="1" w:lastColumn="0" w:lastRow="0" w:noHBand="0" w:noVBand="1" w:val="04A0"/>
       </w:tblPr>
@@ -8188,6 +8300,14 @@
       <w:tblPr>
         <w:tblW w:type="auto" w:w="0"/>
         <w:jc w:val="center"/>
+        <w:tblBorders>
+          <w:top w:val="single" w:sz="4" w:space="0" w:color="8C96A3"/>
+          <w:left w:val="single" w:sz="4" w:space="0" w:color="8C96A3"/>
+          <w:bottom w:val="single" w:sz="4" w:space="0" w:color="8C96A3"/>
+          <w:right w:val="single" w:sz="4" w:space="0" w:color="8C96A3"/>
+          <w:insideH w:val="single" w:sz="4" w:space="0" w:color="8C96A3"/>
+          <w:insideV w:val="single" w:sz="4" w:space="0" w:color="8C96A3"/>
+        </w:tblBorders>
         <w:tblLayout w:type="fixed"/>
         <w:tblLook w:firstColumn="1" w:firstRow="1" w:lastColumn="0" w:lastRow="0" w:noHBand="0" w:noVBand="1" w:val="04A0"/>
       </w:tblPr>
@@ -8742,6 +8862,14 @@
       <w:tblPr>
         <w:tblW w:type="auto" w:w="0"/>
         <w:jc w:val="center"/>
+        <w:tblBorders>
+          <w:top w:val="single" w:sz="4" w:space="0" w:color="8C96A3"/>
+          <w:left w:val="single" w:sz="4" w:space="0" w:color="8C96A3"/>
+          <w:bottom w:val="single" w:sz="4" w:space="0" w:color="8C96A3"/>
+          <w:right w:val="single" w:sz="4" w:space="0" w:color="8C96A3"/>
+          <w:insideH w:val="single" w:sz="4" w:space="0" w:color="8C96A3"/>
+          <w:insideV w:val="single" w:sz="4" w:space="0" w:color="8C96A3"/>
+        </w:tblBorders>
         <w:tblLayout w:type="fixed"/>
         <w:tblLook w:firstColumn="1" w:firstRow="1" w:lastColumn="0" w:lastRow="0" w:noHBand="0" w:noVBand="1" w:val="04A0"/>
       </w:tblPr>
@@ -9296,6 +9424,14 @@
       <w:tblPr>
         <w:tblW w:type="auto" w:w="0"/>
         <w:jc w:val="center"/>
+        <w:tblBorders>
+          <w:top w:val="single" w:sz="4" w:space="0" w:color="8C96A3"/>
+          <w:left w:val="single" w:sz="4" w:space="0" w:color="8C96A3"/>
+          <w:bottom w:val="single" w:sz="4" w:space="0" w:color="8C96A3"/>
+          <w:right w:val="single" w:sz="4" w:space="0" w:color="8C96A3"/>
+          <w:insideH w:val="single" w:sz="4" w:space="0" w:color="8C96A3"/>
+          <w:insideV w:val="single" w:sz="4" w:space="0" w:color="8C96A3"/>
+        </w:tblBorders>
         <w:tblLayout w:type="fixed"/>
         <w:tblLook w:firstColumn="1" w:firstRow="1" w:lastColumn="0" w:lastRow="0" w:noHBand="0" w:noVBand="1" w:val="04A0"/>
       </w:tblPr>
@@ -9837,6 +9973,14 @@
       <w:tblPr>
         <w:tblW w:type="auto" w:w="0"/>
         <w:jc w:val="center"/>
+        <w:tblBorders>
+          <w:top w:val="single" w:sz="4" w:space="0" w:color="8C96A3"/>
+          <w:left w:val="single" w:sz="4" w:space="0" w:color="8C96A3"/>
+          <w:bottom w:val="single" w:sz="4" w:space="0" w:color="8C96A3"/>
+          <w:right w:val="single" w:sz="4" w:space="0" w:color="8C96A3"/>
+          <w:insideH w:val="single" w:sz="4" w:space="0" w:color="8C96A3"/>
+          <w:insideV w:val="single" w:sz="4" w:space="0" w:color="8C96A3"/>
+        </w:tblBorders>
         <w:tblLayout w:type="fixed"/>
         <w:tblLook w:firstColumn="1" w:firstRow="1" w:lastColumn="0" w:lastRow="0" w:noHBand="0" w:noVBand="1" w:val="04A0"/>
       </w:tblPr>
@@ -10401,6 +10545,14 @@
       <w:tblPr>
         <w:tblW w:type="auto" w:w="0"/>
         <w:jc w:val="center"/>
+        <w:tblBorders>
+          <w:top w:val="single" w:sz="4" w:space="0" w:color="8C96A3"/>
+          <w:left w:val="single" w:sz="4" w:space="0" w:color="8C96A3"/>
+          <w:bottom w:val="single" w:sz="4" w:space="0" w:color="8C96A3"/>
+          <w:right w:val="single" w:sz="4" w:space="0" w:color="8C96A3"/>
+          <w:insideH w:val="single" w:sz="4" w:space="0" w:color="8C96A3"/>
+          <w:insideV w:val="single" w:sz="4" w:space="0" w:color="8C96A3"/>
+        </w:tblBorders>
         <w:tblLayout w:type="fixed"/>
         <w:tblLook w:firstColumn="1" w:firstRow="1" w:lastColumn="0" w:lastRow="0" w:noHBand="0" w:noVBand="1" w:val="04A0"/>
       </w:tblPr>
@@ -10968,6 +11120,14 @@
       <w:tblPr>
         <w:tblW w:type="auto" w:w="0"/>
         <w:jc w:val="center"/>
+        <w:tblBorders>
+          <w:top w:val="single" w:sz="4" w:space="0" w:color="8C96A3"/>
+          <w:left w:val="single" w:sz="4" w:space="0" w:color="8C96A3"/>
+          <w:bottom w:val="single" w:sz="4" w:space="0" w:color="8C96A3"/>
+          <w:right w:val="single" w:sz="4" w:space="0" w:color="8C96A3"/>
+          <w:insideH w:val="single" w:sz="4" w:space="0" w:color="8C96A3"/>
+          <w:insideV w:val="single" w:sz="4" w:space="0" w:color="8C96A3"/>
+        </w:tblBorders>
         <w:tblLayout w:type="fixed"/>
         <w:tblLook w:firstColumn="1" w:firstRow="1" w:lastColumn="0" w:lastRow="0" w:noHBand="0" w:noVBand="1" w:val="04A0"/>
       </w:tblPr>
@@ -11522,6 +11682,14 @@
       <w:tblPr>
         <w:tblW w:type="auto" w:w="0"/>
         <w:jc w:val="center"/>
+        <w:tblBorders>
+          <w:top w:val="single" w:sz="4" w:space="0" w:color="8C96A3"/>
+          <w:left w:val="single" w:sz="4" w:space="0" w:color="8C96A3"/>
+          <w:bottom w:val="single" w:sz="4" w:space="0" w:color="8C96A3"/>
+          <w:right w:val="single" w:sz="4" w:space="0" w:color="8C96A3"/>
+          <w:insideH w:val="single" w:sz="4" w:space="0" w:color="8C96A3"/>
+          <w:insideV w:val="single" w:sz="4" w:space="0" w:color="8C96A3"/>
+        </w:tblBorders>
         <w:tblLayout w:type="fixed"/>
         <w:tblLook w:firstColumn="1" w:firstRow="1" w:lastColumn="0" w:lastRow="0" w:noHBand="0" w:noVBand="1" w:val="04A0"/>
       </w:tblPr>
@@ -12089,6 +12257,14 @@
       <w:tblPr>
         <w:tblW w:type="auto" w:w="0"/>
         <w:jc w:val="center"/>
+        <w:tblBorders>
+          <w:top w:val="single" w:sz="4" w:space="0" w:color="8C96A3"/>
+          <w:left w:val="single" w:sz="4" w:space="0" w:color="8C96A3"/>
+          <w:bottom w:val="single" w:sz="4" w:space="0" w:color="8C96A3"/>
+          <w:right w:val="single" w:sz="4" w:space="0" w:color="8C96A3"/>
+          <w:insideH w:val="single" w:sz="4" w:space="0" w:color="8C96A3"/>
+          <w:insideV w:val="single" w:sz="4" w:space="0" w:color="8C96A3"/>
+        </w:tblBorders>
         <w:tblLayout w:type="fixed"/>
         <w:tblLook w:firstColumn="1" w:firstRow="1" w:lastColumn="0" w:lastRow="0" w:noHBand="0" w:noVBand="1" w:val="04A0"/>
       </w:tblPr>
@@ -12653,6 +12829,14 @@
       <w:tblPr>
         <w:tblW w:type="auto" w:w="0"/>
         <w:jc w:val="center"/>
+        <w:tblBorders>
+          <w:top w:val="single" w:sz="4" w:space="0" w:color="8C96A3"/>
+          <w:left w:val="single" w:sz="4" w:space="0" w:color="8C96A3"/>
+          <w:bottom w:val="single" w:sz="4" w:space="0" w:color="8C96A3"/>
+          <w:right w:val="single" w:sz="4" w:space="0" w:color="8C96A3"/>
+          <w:insideH w:val="single" w:sz="4" w:space="0" w:color="8C96A3"/>
+          <w:insideV w:val="single" w:sz="4" w:space="0" w:color="8C96A3"/>
+        </w:tblBorders>
         <w:tblLayout w:type="fixed"/>
         <w:tblLook w:firstColumn="1" w:firstRow="1" w:lastColumn="0" w:lastRow="0" w:noHBand="0" w:noVBand="1" w:val="04A0"/>
       </w:tblPr>
@@ -13233,6 +13417,14 @@
       <w:tblPr>
         <w:tblW w:type="auto" w:w="0"/>
         <w:jc w:val="center"/>
+        <w:tblBorders>
+          <w:top w:val="single" w:sz="4" w:space="0" w:color="8C96A3"/>
+          <w:left w:val="single" w:sz="4" w:space="0" w:color="8C96A3"/>
+          <w:bottom w:val="single" w:sz="4" w:space="0" w:color="8C96A3"/>
+          <w:right w:val="single" w:sz="4" w:space="0" w:color="8C96A3"/>
+          <w:insideH w:val="single" w:sz="4" w:space="0" w:color="8C96A3"/>
+          <w:insideV w:val="single" w:sz="4" w:space="0" w:color="8C96A3"/>
+        </w:tblBorders>
         <w:tblLayout w:type="fixed"/>
         <w:tblLook w:firstColumn="1" w:firstRow="1" w:lastColumn="0" w:lastRow="0" w:noHBand="0" w:noVBand="1" w:val="04A0"/>
       </w:tblPr>
@@ -13774,6 +13966,14 @@
       <w:tblPr>
         <w:tblW w:type="auto" w:w="0"/>
         <w:jc w:val="center"/>
+        <w:tblBorders>
+          <w:top w:val="single" w:sz="4" w:space="0" w:color="8C96A3"/>
+          <w:left w:val="single" w:sz="4" w:space="0" w:color="8C96A3"/>
+          <w:bottom w:val="single" w:sz="4" w:space="0" w:color="8C96A3"/>
+          <w:right w:val="single" w:sz="4" w:space="0" w:color="8C96A3"/>
+          <w:insideH w:val="single" w:sz="4" w:space="0" w:color="8C96A3"/>
+          <w:insideV w:val="single" w:sz="4" w:space="0" w:color="8C96A3"/>
+        </w:tblBorders>
         <w:tblLayout w:type="fixed"/>
         <w:tblLook w:firstColumn="1" w:firstRow="1" w:lastColumn="0" w:lastRow="0" w:noHBand="0" w:noVBand="1" w:val="04A0"/>
       </w:tblPr>
@@ -14341,6 +14541,14 @@
       <w:tblPr>
         <w:tblW w:type="auto" w:w="0"/>
         <w:jc w:val="center"/>
+        <w:tblBorders>
+          <w:top w:val="single" w:sz="4" w:space="0" w:color="8C96A3"/>
+          <w:left w:val="single" w:sz="4" w:space="0" w:color="8C96A3"/>
+          <w:bottom w:val="single" w:sz="4" w:space="0" w:color="8C96A3"/>
+          <w:right w:val="single" w:sz="4" w:space="0" w:color="8C96A3"/>
+          <w:insideH w:val="single" w:sz="4" w:space="0" w:color="8C96A3"/>
+          <w:insideV w:val="single" w:sz="4" w:space="0" w:color="8C96A3"/>
+        </w:tblBorders>
         <w:tblLayout w:type="fixed"/>
         <w:tblLook w:firstColumn="1" w:firstRow="1" w:lastColumn="0" w:lastRow="0" w:noHBand="0" w:noVBand="1" w:val="04A0"/>
       </w:tblPr>
@@ -14892,6 +15100,14 @@
       <w:tblPr>
         <w:tblW w:type="auto" w:w="0"/>
         <w:jc w:val="center"/>
+        <w:tblBorders>
+          <w:top w:val="single" w:sz="4" w:space="0" w:color="8C96A3"/>
+          <w:left w:val="single" w:sz="4" w:space="0" w:color="8C96A3"/>
+          <w:bottom w:val="single" w:sz="4" w:space="0" w:color="8C96A3"/>
+          <w:right w:val="single" w:sz="4" w:space="0" w:color="8C96A3"/>
+          <w:insideH w:val="single" w:sz="4" w:space="0" w:color="8C96A3"/>
+          <w:insideV w:val="single" w:sz="4" w:space="0" w:color="8C96A3"/>
+        </w:tblBorders>
         <w:tblLayout w:type="fixed"/>
         <w:tblLook w:firstColumn="1" w:firstRow="1" w:lastColumn="0" w:lastRow="0" w:noHBand="0" w:noVBand="1" w:val="04A0"/>
       </w:tblPr>
@@ -15446,6 +15662,14 @@
       <w:tblPr>
         <w:tblW w:type="auto" w:w="0"/>
         <w:jc w:val="center"/>
+        <w:tblBorders>
+          <w:top w:val="single" w:sz="4" w:space="0" w:color="8C96A3"/>
+          <w:left w:val="single" w:sz="4" w:space="0" w:color="8C96A3"/>
+          <w:bottom w:val="single" w:sz="4" w:space="0" w:color="8C96A3"/>
+          <w:right w:val="single" w:sz="4" w:space="0" w:color="8C96A3"/>
+          <w:insideH w:val="single" w:sz="4" w:space="0" w:color="8C96A3"/>
+          <w:insideV w:val="single" w:sz="4" w:space="0" w:color="8C96A3"/>
+        </w:tblBorders>
         <w:tblLayout w:type="fixed"/>
         <w:tblLook w:firstColumn="1" w:firstRow="1" w:lastColumn="0" w:lastRow="0" w:noHBand="0" w:noVBand="1" w:val="04A0"/>
       </w:tblPr>
@@ -16000,6 +16224,14 @@
       <w:tblPr>
         <w:tblW w:type="auto" w:w="0"/>
         <w:jc w:val="center"/>
+        <w:tblBorders>
+          <w:top w:val="single" w:sz="4" w:space="0" w:color="8C96A3"/>
+          <w:left w:val="single" w:sz="4" w:space="0" w:color="8C96A3"/>
+          <w:bottom w:val="single" w:sz="4" w:space="0" w:color="8C96A3"/>
+          <w:right w:val="single" w:sz="4" w:space="0" w:color="8C96A3"/>
+          <w:insideH w:val="single" w:sz="4" w:space="0" w:color="8C96A3"/>
+          <w:insideV w:val="single" w:sz="4" w:space="0" w:color="8C96A3"/>
+        </w:tblBorders>
         <w:tblLayout w:type="fixed"/>
         <w:tblLook w:firstColumn="1" w:firstRow="1" w:lastColumn="0" w:lastRow="0" w:noHBand="0" w:noVBand="1" w:val="04A0"/>
       </w:tblPr>
@@ -16551,6 +16783,14 @@
       <w:tblPr>
         <w:tblW w:type="auto" w:w="0"/>
         <w:jc w:val="center"/>
+        <w:tblBorders>
+          <w:top w:val="single" w:sz="4" w:space="0" w:color="8C96A3"/>
+          <w:left w:val="single" w:sz="4" w:space="0" w:color="8C96A3"/>
+          <w:bottom w:val="single" w:sz="4" w:space="0" w:color="8C96A3"/>
+          <w:right w:val="single" w:sz="4" w:space="0" w:color="8C96A3"/>
+          <w:insideH w:val="single" w:sz="4" w:space="0" w:color="8C96A3"/>
+          <w:insideV w:val="single" w:sz="4" w:space="0" w:color="8C96A3"/>
+        </w:tblBorders>
         <w:tblLayout w:type="fixed"/>
         <w:tblLook w:firstColumn="1" w:firstRow="1" w:lastColumn="0" w:lastRow="0" w:noHBand="0" w:noVBand="1" w:val="04A0"/>
       </w:tblPr>
@@ -17105,6 +17345,14 @@
       <w:tblPr>
         <w:tblW w:type="auto" w:w="0"/>
         <w:jc w:val="center"/>
+        <w:tblBorders>
+          <w:top w:val="single" w:sz="4" w:space="0" w:color="8C96A3"/>
+          <w:left w:val="single" w:sz="4" w:space="0" w:color="8C96A3"/>
+          <w:bottom w:val="single" w:sz="4" w:space="0" w:color="8C96A3"/>
+          <w:right w:val="single" w:sz="4" w:space="0" w:color="8C96A3"/>
+          <w:insideH w:val="single" w:sz="4" w:space="0" w:color="8C96A3"/>
+          <w:insideV w:val="single" w:sz="4" w:space="0" w:color="8C96A3"/>
+        </w:tblBorders>
         <w:tblLayout w:type="fixed"/>
         <w:tblLook w:firstColumn="1" w:firstRow="1" w:lastColumn="0" w:lastRow="0" w:noHBand="0" w:noVBand="1" w:val="04A0"/>
       </w:tblPr>
@@ -17669,6 +17917,14 @@
       <w:tblPr>
         <w:tblW w:type="auto" w:w="0"/>
         <w:jc w:val="center"/>
+        <w:tblBorders>
+          <w:top w:val="single" w:sz="4" w:space="0" w:color="8C96A3"/>
+          <w:left w:val="single" w:sz="4" w:space="0" w:color="8C96A3"/>
+          <w:bottom w:val="single" w:sz="4" w:space="0" w:color="8C96A3"/>
+          <w:right w:val="single" w:sz="4" w:space="0" w:color="8C96A3"/>
+          <w:insideH w:val="single" w:sz="4" w:space="0" w:color="8C96A3"/>
+          <w:insideV w:val="single" w:sz="4" w:space="0" w:color="8C96A3"/>
+        </w:tblBorders>
         <w:tblLayout w:type="fixed"/>
         <w:tblLook w:firstColumn="1" w:firstRow="1" w:lastColumn="0" w:lastRow="0" w:noHBand="0" w:noVBand="1" w:val="04A0"/>
       </w:tblPr>
@@ -18223,6 +18479,14 @@
       <w:tblPr>
         <w:tblW w:type="auto" w:w="0"/>
         <w:jc w:val="center"/>
+        <w:tblBorders>
+          <w:top w:val="single" w:sz="4" w:space="0" w:color="8C96A3"/>
+          <w:left w:val="single" w:sz="4" w:space="0" w:color="8C96A3"/>
+          <w:bottom w:val="single" w:sz="4" w:space="0" w:color="8C96A3"/>
+          <w:right w:val="single" w:sz="4" w:space="0" w:color="8C96A3"/>
+          <w:insideH w:val="single" w:sz="4" w:space="0" w:color="8C96A3"/>
+          <w:insideV w:val="single" w:sz="4" w:space="0" w:color="8C96A3"/>
+        </w:tblBorders>
         <w:tblLayout w:type="fixed"/>
         <w:tblLook w:firstColumn="1" w:firstRow="1" w:lastColumn="0" w:lastRow="0" w:noHBand="0" w:noVBand="1" w:val="04A0"/>
       </w:tblPr>
@@ -18798,6 +19062,14 @@
       <w:tblPr>
         <w:tblStyle w:val="TableGrid"/>
         <w:tblW w:type="auto" w:w="0"/>
+        <w:tblBorders>
+          <w:top w:val="single" w:sz="4" w:space="0" w:color="8C96A3"/>
+          <w:left w:val="single" w:sz="4" w:space="0" w:color="8C96A3"/>
+          <w:bottom w:val="single" w:sz="4" w:space="0" w:color="8C96A3"/>
+          <w:right w:val="single" w:sz="4" w:space="0" w:color="8C96A3"/>
+          <w:insideH w:val="single" w:sz="4" w:space="0" w:color="8C96A3"/>
+          <w:insideV w:val="single" w:sz="4" w:space="0" w:color="8C96A3"/>
+        </w:tblBorders>
         <w:tblLook w:firstColumn="1" w:firstRow="1" w:lastColumn="0" w:lastRow="0" w:noHBand="0" w:noVBand="1" w:val="04A0"/>
       </w:tblPr>
       <w:tblGrid>
@@ -19610,6 +19882,14 @@
       <w:tblPr>
         <w:tblStyle w:val="TableGrid"/>
         <w:tblW w:type="auto" w:w="0"/>
+        <w:tblBorders>
+          <w:top w:val="single" w:sz="4" w:space="0" w:color="8C96A3"/>
+          <w:left w:val="single" w:sz="4" w:space="0" w:color="8C96A3"/>
+          <w:bottom w:val="single" w:sz="4" w:space="0" w:color="8C96A3"/>
+          <w:right w:val="single" w:sz="4" w:space="0" w:color="8C96A3"/>
+          <w:insideH w:val="single" w:sz="4" w:space="0" w:color="8C96A3"/>
+          <w:insideV w:val="single" w:sz="4" w:space="0" w:color="8C96A3"/>
+        </w:tblBorders>
         <w:tblLook w:firstColumn="1" w:firstRow="1" w:lastColumn="0" w:lastRow="0" w:noHBand="0" w:noVBand="1" w:val="04A0"/>
       </w:tblPr>
       <w:tblGrid>

</xml_diff>

<commit_message>
docs: plan de pruebas CRUD con las instrucciones de la plantilla en evidencia e ID de defecto
Co-Authored-By: Claude Opus 5.5 <noreply@anthropic.com>
</commit_message>
<xml_diff>
--- a/docs/entrega-2do-corte/03_Verificacion_y_validacion/Plan_de_Pruebas_50_Casos_CRUD_StockPot.docx
+++ b/docs/entrega-2do-corte/03_Verificacion_y_validacion/Plan_de_Pruebas_50_Casos_CRUD_StockPot.docx
@@ -297,7 +297,7 @@
         <w:spacing w:after="120"/>
       </w:pPr>
       <w:r>
-        <w:t>Evaluación: cada caso se ejecuta en la interfaz web siguiendo los pasos descritos. El bloque de evaluación de cada caso (evidencia observada, estado final e ID del defecto) queda en blanco para que lo diligencie la evaluadora. Criterio de estado: A = Aprobado, C = Condicionado, R = Rechazado. Además, el equipo verifica las mismas operaciones de forma automatizada contra la API con pytest (ver el Informe de pruebas realizadas).</w:t>
+        <w:t>Evaluación: cada caso se ejecuta en la interfaz web siguiendo los pasos descritos. El bloque de evaluación de cada caso (evidencia observada, estado final e ID del defecto) lo diligencia la evaluadora. Criterio de estado: A = Aprobado, C = Condicionado, R = Rechazado. Además, el equipo verifica las mismas operaciones de forma automatizada contra la API con pytest (ver el Informe de pruebas realizadas).</w:t>
       </w:r>
     </w:p>
     <w:p>
@@ -795,6 +795,7 @@
                 <w:color w:val="323232"/>
                 <w:sz w:val="18"/>
               </w:rPr>
+              <w:t>[Lo que ocurrió realmente durante la prueba]</w:t>
             </w:r>
           </w:p>
         </w:tc>
@@ -873,6 +874,7 @@
                 <w:color w:val="323232"/>
                 <w:sz w:val="18"/>
               </w:rPr>
+              <w:t>[Ej. BUG-012 o N/A si aprobó]</w:t>
             </w:r>
           </w:p>
         </w:tc>
@@ -1357,6 +1359,7 @@
                 <w:color w:val="323232"/>
                 <w:sz w:val="18"/>
               </w:rPr>
+              <w:t>[Lo que ocurrió realmente durante la prueba]</w:t>
             </w:r>
           </w:p>
         </w:tc>
@@ -1435,6 +1438,7 @@
                 <w:color w:val="323232"/>
                 <w:sz w:val="18"/>
               </w:rPr>
+              <w:t>[Ej. BUG-012 o N/A si aprobó]</w:t>
             </w:r>
           </w:p>
         </w:tc>
@@ -1932,6 +1936,7 @@
                 <w:color w:val="323232"/>
                 <w:sz w:val="18"/>
               </w:rPr>
+              <w:t>[Lo que ocurrió realmente durante la prueba]</w:t>
             </w:r>
           </w:p>
         </w:tc>
@@ -2010,6 +2015,7 @@
                 <w:color w:val="323232"/>
                 <w:sz w:val="18"/>
               </w:rPr>
+              <w:t>[Ej. BUG-012 o N/A si aprobó]</w:t>
             </w:r>
           </w:p>
         </w:tc>
@@ -2507,6 +2513,7 @@
                 <w:color w:val="323232"/>
                 <w:sz w:val="18"/>
               </w:rPr>
+              <w:t>[Lo que ocurrió realmente durante la prueba]</w:t>
             </w:r>
           </w:p>
         </w:tc>
@@ -2585,6 +2592,7 @@
                 <w:color w:val="323232"/>
                 <w:sz w:val="18"/>
               </w:rPr>
+              <w:t>[Ej. BUG-012 o N/A si aprobó]</w:t>
             </w:r>
           </w:p>
         </w:tc>
@@ -3082,6 +3090,7 @@
                 <w:color w:val="323232"/>
                 <w:sz w:val="18"/>
               </w:rPr>
+              <w:t>[Lo que ocurrió realmente durante la prueba]</w:t>
             </w:r>
           </w:p>
         </w:tc>
@@ -3160,6 +3169,7 @@
                 <w:color w:val="323232"/>
                 <w:sz w:val="18"/>
               </w:rPr>
+              <w:t>[Ej. BUG-012 o N/A si aprobó]</w:t>
             </w:r>
           </w:p>
         </w:tc>
@@ -3654,6 +3664,7 @@
                 <w:color w:val="323232"/>
                 <w:sz w:val="18"/>
               </w:rPr>
+              <w:t>[Lo que ocurrió realmente durante la prueba]</w:t>
             </w:r>
           </w:p>
         </w:tc>
@@ -3732,6 +3743,7 @@
                 <w:color w:val="323232"/>
                 <w:sz w:val="18"/>
               </w:rPr>
+              <w:t>[Ej. BUG-012 o N/A si aprobó]</w:t>
             </w:r>
           </w:p>
         </w:tc>
@@ -4203,6 +4215,7 @@
                 <w:color w:val="323232"/>
                 <w:sz w:val="18"/>
               </w:rPr>
+              <w:t>[Lo que ocurrió realmente durante la prueba]</w:t>
             </w:r>
           </w:p>
         </w:tc>
@@ -4281,6 +4294,7 @@
                 <w:color w:val="323232"/>
                 <w:sz w:val="18"/>
               </w:rPr>
+              <w:t>[Ej. BUG-012 o N/A si aprobó]</w:t>
             </w:r>
           </w:p>
         </w:tc>
@@ -4778,6 +4792,7 @@
                 <w:color w:val="323232"/>
                 <w:sz w:val="18"/>
               </w:rPr>
+              <w:t>[Lo que ocurrió realmente durante la prueba]</w:t>
             </w:r>
           </w:p>
         </w:tc>
@@ -4856,6 +4871,7 @@
                 <w:color w:val="323232"/>
                 <w:sz w:val="18"/>
               </w:rPr>
+              <w:t>[Ej. BUG-012 o N/A si aprobó]</w:t>
             </w:r>
           </w:p>
         </w:tc>
@@ -5340,6 +5356,7 @@
                 <w:color w:val="323232"/>
                 <w:sz w:val="18"/>
               </w:rPr>
+              <w:t>[Lo que ocurrió realmente durante la prueba]</w:t>
             </w:r>
           </w:p>
         </w:tc>
@@ -5418,6 +5435,7 @@
                 <w:color w:val="323232"/>
                 <w:sz w:val="18"/>
               </w:rPr>
+              <w:t>[Ej. BUG-012 o N/A si aprobó]</w:t>
             </w:r>
           </w:p>
         </w:tc>
@@ -5925,6 +5943,7 @@
                 <w:color w:val="323232"/>
                 <w:sz w:val="18"/>
               </w:rPr>
+              <w:t>[Lo que ocurrió realmente durante la prueba]</w:t>
             </w:r>
           </w:p>
         </w:tc>
@@ -6003,6 +6022,7 @@
                 <w:color w:val="323232"/>
                 <w:sz w:val="18"/>
               </w:rPr>
+              <w:t>[Ej. BUG-012 o N/A si aprobó]</w:t>
             </w:r>
           </w:p>
         </w:tc>
@@ -6474,6 +6494,7 @@
                 <w:color w:val="323232"/>
                 <w:sz w:val="18"/>
               </w:rPr>
+              <w:t>[Lo que ocurrió realmente durante la prueba]</w:t>
             </w:r>
           </w:p>
         </w:tc>
@@ -6552,6 +6573,7 @@
                 <w:color w:val="323232"/>
                 <w:sz w:val="18"/>
               </w:rPr>
+              <w:t>[Ej. BUG-012 o N/A si aprobó]</w:t>
             </w:r>
           </w:p>
         </w:tc>
@@ -7036,6 +7058,7 @@
                 <w:color w:val="323232"/>
                 <w:sz w:val="18"/>
               </w:rPr>
+              <w:t>[Lo que ocurrió realmente durante la prueba]</w:t>
             </w:r>
           </w:p>
         </w:tc>
@@ -7114,6 +7137,7 @@
                 <w:color w:val="323232"/>
                 <w:sz w:val="18"/>
               </w:rPr>
+              <w:t>[Ej. BUG-012 o N/A si aprobó]</w:t>
             </w:r>
           </w:p>
         </w:tc>
@@ -7585,6 +7609,7 @@
                 <w:color w:val="323232"/>
                 <w:sz w:val="18"/>
               </w:rPr>
+              <w:t>[Lo que ocurrió realmente durante la prueba]</w:t>
             </w:r>
           </w:p>
         </w:tc>
@@ -7663,6 +7688,7 @@
                 <w:color w:val="323232"/>
                 <w:sz w:val="18"/>
               </w:rPr>
+              <w:t>[Ej. BUG-012 o N/A si aprobó]</w:t>
             </w:r>
           </w:p>
         </w:tc>
@@ -8157,6 +8183,7 @@
                 <w:color w:val="323232"/>
                 <w:sz w:val="18"/>
               </w:rPr>
+              <w:t>[Lo que ocurrió realmente durante la prueba]</w:t>
             </w:r>
           </w:p>
         </w:tc>
@@ -8235,6 +8262,7 @@
                 <w:color w:val="323232"/>
                 <w:sz w:val="18"/>
               </w:rPr>
+              <w:t>[Ej. BUG-012 o N/A si aprobó]</w:t>
             </w:r>
           </w:p>
         </w:tc>
@@ -8719,6 +8747,7 @@
                 <w:color w:val="323232"/>
                 <w:sz w:val="18"/>
               </w:rPr>
+              <w:t>[Lo que ocurrió realmente durante la prueba]</w:t>
             </w:r>
           </w:p>
         </w:tc>
@@ -8797,6 +8826,7 @@
                 <w:color w:val="323232"/>
                 <w:sz w:val="18"/>
               </w:rPr>
+              <w:t>[Ej. BUG-012 o N/A si aprobó]</w:t>
             </w:r>
           </w:p>
         </w:tc>
@@ -9281,6 +9311,7 @@
                 <w:color w:val="323232"/>
                 <w:sz w:val="18"/>
               </w:rPr>
+              <w:t>[Lo que ocurrió realmente durante la prueba]</w:t>
             </w:r>
           </w:p>
         </w:tc>
@@ -9359,6 +9390,7 @@
                 <w:color w:val="323232"/>
                 <w:sz w:val="18"/>
               </w:rPr>
+              <w:t>[Ej. BUG-012 o N/A si aprobó]</w:t>
             </w:r>
           </w:p>
         </w:tc>
@@ -9830,6 +9862,7 @@
                 <w:color w:val="323232"/>
                 <w:sz w:val="18"/>
               </w:rPr>
+              <w:t>[Lo que ocurrió realmente durante la prueba]</w:t>
             </w:r>
           </w:p>
         </w:tc>
@@ -9908,6 +9941,7 @@
                 <w:color w:val="323232"/>
                 <w:sz w:val="18"/>
               </w:rPr>
+              <w:t>[Ej. BUG-012 o N/A si aprobó]</w:t>
             </w:r>
           </w:p>
         </w:tc>
@@ -10392,6 +10426,7 @@
                 <w:color w:val="323232"/>
                 <w:sz w:val="18"/>
               </w:rPr>
+              <w:t>[Lo que ocurrió realmente durante la prueba]</w:t>
             </w:r>
           </w:p>
         </w:tc>
@@ -10470,6 +10505,7 @@
                 <w:color w:val="323232"/>
                 <w:sz w:val="18"/>
               </w:rPr>
+              <w:t>[Ej. BUG-012 o N/A si aprobó]</w:t>
             </w:r>
           </w:p>
         </w:tc>
@@ -10977,6 +11013,7 @@
                 <w:color w:val="323232"/>
                 <w:sz w:val="18"/>
               </w:rPr>
+              <w:t>[Lo que ocurrió realmente durante la prueba]</w:t>
             </w:r>
           </w:p>
         </w:tc>
@@ -11055,6 +11092,7 @@
                 <w:color w:val="323232"/>
                 <w:sz w:val="18"/>
               </w:rPr>
+              <w:t>[Ej. BUG-012 o N/A si aprobó]</w:t>
             </w:r>
           </w:p>
         </w:tc>
@@ -11539,6 +11577,7 @@
                 <w:color w:val="323232"/>
                 <w:sz w:val="18"/>
               </w:rPr>
+              <w:t>[Lo que ocurrió realmente durante la prueba]</w:t>
             </w:r>
           </w:p>
         </w:tc>
@@ -11617,6 +11656,7 @@
                 <w:color w:val="323232"/>
                 <w:sz w:val="18"/>
               </w:rPr>
+              <w:t>[Ej. BUG-012 o N/A si aprobó]</w:t>
             </w:r>
           </w:p>
         </w:tc>
@@ -12114,6 +12154,7 @@
                 <w:color w:val="323232"/>
                 <w:sz w:val="18"/>
               </w:rPr>
+              <w:t>[Lo que ocurrió realmente durante la prueba]</w:t>
             </w:r>
           </w:p>
         </w:tc>
@@ -12192,6 +12233,7 @@
                 <w:color w:val="323232"/>
                 <w:sz w:val="18"/>
               </w:rPr>
+              <w:t>[Ej. BUG-012 o N/A si aprobó]</w:t>
             </w:r>
           </w:p>
         </w:tc>
@@ -12676,6 +12718,7 @@
                 <w:color w:val="323232"/>
                 <w:sz w:val="18"/>
               </w:rPr>
+              <w:t>[Lo que ocurrió realmente durante la prueba]</w:t>
             </w:r>
           </w:p>
         </w:tc>
@@ -12754,6 +12797,7 @@
                 <w:color w:val="323232"/>
                 <w:sz w:val="18"/>
               </w:rPr>
+              <w:t>[Ej. BUG-012 o N/A si aprobó]</w:t>
             </w:r>
           </w:p>
         </w:tc>
@@ -13274,6 +13318,7 @@
                 <w:color w:val="323232"/>
                 <w:sz w:val="18"/>
               </w:rPr>
+              <w:t>[Lo que ocurrió realmente durante la prueba]</w:t>
             </w:r>
           </w:p>
         </w:tc>
@@ -13352,6 +13397,7 @@
                 <w:color w:val="323232"/>
                 <w:sz w:val="18"/>
               </w:rPr>
+              <w:t>[Ej. BUG-012 o N/A si aprobó]</w:t>
             </w:r>
           </w:p>
         </w:tc>
@@ -13823,6 +13869,7 @@
                 <w:color w:val="323232"/>
                 <w:sz w:val="18"/>
               </w:rPr>
+              <w:t>[Lo que ocurrió realmente durante la prueba]</w:t>
             </w:r>
           </w:p>
         </w:tc>
@@ -13901,6 +13948,7 @@
                 <w:color w:val="323232"/>
                 <w:sz w:val="18"/>
               </w:rPr>
+              <w:t>[Ej. BUG-012 o N/A si aprobó]</w:t>
             </w:r>
           </w:p>
         </w:tc>
@@ -14398,6 +14446,7 @@
                 <w:color w:val="323232"/>
                 <w:sz w:val="18"/>
               </w:rPr>
+              <w:t>[Lo que ocurrió realmente durante la prueba]</w:t>
             </w:r>
           </w:p>
         </w:tc>
@@ -14476,6 +14525,7 @@
                 <w:color w:val="323232"/>
                 <w:sz w:val="18"/>
               </w:rPr>
+              <w:t>[Ej. BUG-012 o N/A si aprobó]</w:t>
             </w:r>
           </w:p>
         </w:tc>
@@ -14947,6 +14997,7 @@
                 <w:color w:val="323232"/>
                 <w:sz w:val="18"/>
               </w:rPr>
+              <w:t>[Lo que ocurrió realmente durante la prueba]</w:t>
             </w:r>
           </w:p>
         </w:tc>
@@ -15025,6 +15076,7 @@
                 <w:color w:val="323232"/>
                 <w:sz w:val="18"/>
               </w:rPr>
+              <w:t>[Ej. BUG-012 o N/A si aprobó]</w:t>
             </w:r>
           </w:p>
         </w:tc>
@@ -15519,6 +15571,7 @@
                 <w:color w:val="323232"/>
                 <w:sz w:val="18"/>
               </w:rPr>
+              <w:t>[Lo que ocurrió realmente durante la prueba]</w:t>
             </w:r>
           </w:p>
         </w:tc>
@@ -15597,6 +15650,7 @@
                 <w:color w:val="323232"/>
                 <w:sz w:val="18"/>
               </w:rPr>
+              <w:t>[Ej. BUG-012 o N/A si aprobó]</w:t>
             </w:r>
           </w:p>
         </w:tc>
@@ -16081,6 +16135,7 @@
                 <w:color w:val="323232"/>
                 <w:sz w:val="18"/>
               </w:rPr>
+              <w:t>[Lo que ocurrió realmente durante la prueba]</w:t>
             </w:r>
           </w:p>
         </w:tc>
@@ -16159,6 +16214,7 @@
                 <w:color w:val="323232"/>
                 <w:sz w:val="18"/>
               </w:rPr>
+              <w:t>[Ej. BUG-012 o N/A si aprobó]</w:t>
             </w:r>
           </w:p>
         </w:tc>
@@ -16630,6 +16686,7 @@
                 <w:color w:val="323232"/>
                 <w:sz w:val="18"/>
               </w:rPr>
+              <w:t>[Lo que ocurrió realmente durante la prueba]</w:t>
             </w:r>
           </w:p>
         </w:tc>
@@ -16708,6 +16765,7 @@
                 <w:color w:val="323232"/>
                 <w:sz w:val="18"/>
               </w:rPr>
+              <w:t>[Ej. BUG-012 o N/A si aprobó]</w:t>
             </w:r>
           </w:p>
         </w:tc>
@@ -17202,6 +17260,7 @@
                 <w:color w:val="323232"/>
                 <w:sz w:val="18"/>
               </w:rPr>
+              <w:t>[Lo que ocurrió realmente durante la prueba]</w:t>
             </w:r>
           </w:p>
         </w:tc>
@@ -17280,6 +17339,7 @@
                 <w:color w:val="323232"/>
                 <w:sz w:val="18"/>
               </w:rPr>
+              <w:t>[Ej. BUG-012 o N/A si aprobó]</w:t>
             </w:r>
           </w:p>
         </w:tc>
@@ -17764,6 +17824,7 @@
                 <w:color w:val="323232"/>
                 <w:sz w:val="18"/>
               </w:rPr>
+              <w:t>[Lo que ocurrió realmente durante la prueba]</w:t>
             </w:r>
           </w:p>
         </w:tc>
@@ -17842,6 +17903,7 @@
                 <w:color w:val="323232"/>
                 <w:sz w:val="18"/>
               </w:rPr>
+              <w:t>[Ej. BUG-012 o N/A si aprobó]</w:t>
             </w:r>
           </w:p>
         </w:tc>
@@ -18336,6 +18398,7 @@
                 <w:color w:val="323232"/>
                 <w:sz w:val="18"/>
               </w:rPr>
+              <w:t>[Lo que ocurrió realmente durante la prueba]</w:t>
             </w:r>
           </w:p>
         </w:tc>
@@ -18414,6 +18477,7 @@
                 <w:color w:val="323232"/>
                 <w:sz w:val="18"/>
               </w:rPr>
+              <w:t>[Ej. BUG-012 o N/A si aprobó]</w:t>
             </w:r>
           </w:p>
         </w:tc>
@@ -18872,6 +18936,7 @@
                 <w:color w:val="323232"/>
                 <w:sz w:val="18"/>
               </w:rPr>
+              <w:t>[Lo que ocurrió realmente durante la prueba]</w:t>
             </w:r>
           </w:p>
         </w:tc>
@@ -18950,6 +19015,7 @@
                 <w:color w:val="323232"/>
                 <w:sz w:val="18"/>
               </w:rPr>
+              <w:t>[Ej. BUG-012 o N/A si aprobó]</w:t>
             </w:r>
           </w:p>
         </w:tc>

</xml_diff>